<commit_message>
BIT - U1 - Review amendments
</commit_message>
<xml_diff>
--- a/src/site/pdfs/bit_u1_s1_p4_risk_assessment.docx
+++ b/src/site/pdfs/bit_u1_s1_p4_risk_assessment.docx
@@ -4045,10 +4045,10 @@
 </file>
 
 <file path=customXml/item2.xml><?xml version="1.0" encoding="utf-8"?>
-<ct:contentTypeSchema xmlns:ct="http://schemas.microsoft.com/office/2006/metadata/contentType" xmlns:ma="http://schemas.microsoft.com/office/2006/metadata/properties/metaAttributes" ct:_="" ma:_="" ma:contentTypeName="Document" ma:contentTypeID="0x0101008D8C64AC35551642A370F14BCED8A5B8" ma:contentTypeVersion="6" ma:contentTypeDescription="Create a new document." ma:contentTypeScope="" ma:versionID="3e93754de3df4559b1011d95ec22bc10">
-  <xsd:schema xmlns:xsd="http://www.w3.org/2001/XMLSchema" xmlns:xs="http://www.w3.org/2001/XMLSchema" xmlns:p="http://schemas.microsoft.com/office/2006/metadata/properties" xmlns:ns2="4ae63ddd-484a-464b-bb41-53912b004be7" xmlns:ns3="c6b11a66-ed80-4a70-a8b5-1ed9a8833426" targetNamespace="http://schemas.microsoft.com/office/2006/metadata/properties" ma:root="true" ma:fieldsID="4f5aeedb13438027df3a6b0fb392a26a" ns2:_="" ns3:_="">
-    <xsd:import namespace="4ae63ddd-484a-464b-bb41-53912b004be7"/>
-    <xsd:import namespace="c6b11a66-ed80-4a70-a8b5-1ed9a8833426"/>
+<ct:contentTypeSchema xmlns:ct="http://schemas.microsoft.com/office/2006/metadata/contentType" xmlns:ma="http://schemas.microsoft.com/office/2006/metadata/properties/metaAttributes" ct:_="" ma:_="" ma:contentTypeName="Document" ma:contentTypeID="0x01010098F5C7857A4981418B282ABD30FEE605" ma:contentTypeVersion="13" ma:contentTypeDescription="Create a new document." ma:contentTypeScope="" ma:versionID="6d10e887ac5441067ae06e3a246f0e1b">
+  <xsd:schema xmlns:xsd="http://www.w3.org/2001/XMLSchema" xmlns:xs="http://www.w3.org/2001/XMLSchema" xmlns:p="http://schemas.microsoft.com/office/2006/metadata/properties" xmlns:ns2="98f0678e-2b8a-4b59-aaee-95acbf30ff79" xmlns:ns3="6bf2fe62-5324-41f9-928d-00b78b26d69e" targetNamespace="http://schemas.microsoft.com/office/2006/metadata/properties" ma:root="true" ma:fieldsID="09aa99d6b23ca3720f06fefae05b7cdf" ns2:_="" ns3:_="">
+    <xsd:import namespace="98f0678e-2b8a-4b59-aaee-95acbf30ff79"/>
+    <xsd:import namespace="6bf2fe62-5324-41f9-928d-00b78b26d69e"/>
     <xsd:element name="properties">
       <xsd:complexType>
         <xsd:sequence>
@@ -4057,10 +4057,16 @@
               <xsd:all>
                 <xsd:element ref="ns2:MediaServiceMetadata" minOccurs="0"/>
                 <xsd:element ref="ns2:MediaServiceFastMetadata" minOccurs="0"/>
-                <xsd:element ref="ns2:MediaServiceDateTaken" minOccurs="0"/>
-                <xsd:element ref="ns2:MediaLengthInSeconds" minOccurs="0"/>
+                <xsd:element ref="ns2:MediaServiceAutoKeyPoints" minOccurs="0"/>
+                <xsd:element ref="ns2:MediaServiceKeyPoints" minOccurs="0"/>
                 <xsd:element ref="ns3:SharedWithUsers" minOccurs="0"/>
                 <xsd:element ref="ns3:SharedWithDetails" minOccurs="0"/>
+                <xsd:element ref="ns2:lcf76f155ced4ddcb4097134ff3c332f" minOccurs="0"/>
+                <xsd:element ref="ns3:TaxCatchAll" minOccurs="0"/>
+                <xsd:element ref="ns2:MediaServiceOCR" minOccurs="0"/>
+                <xsd:element ref="ns2:MediaServiceGenerationTime" minOccurs="0"/>
+                <xsd:element ref="ns2:MediaServiceEventHashCode" minOccurs="0"/>
+                <xsd:element ref="ns2:MediaServiceDateTaken" minOccurs="0"/>
               </xsd:all>
             </xsd:complexType>
           </xsd:element>
@@ -4068,7 +4074,7 @@
       </xsd:complexType>
     </xsd:element>
   </xsd:schema>
-  <xsd:schema xmlns:xsd="http://www.w3.org/2001/XMLSchema" xmlns:xs="http://www.w3.org/2001/XMLSchema" xmlns:dms="http://schemas.microsoft.com/office/2006/documentManagement/types" xmlns:pc="http://schemas.microsoft.com/office/infopath/2007/PartnerControls" targetNamespace="4ae63ddd-484a-464b-bb41-53912b004be7" elementFormDefault="qualified">
+  <xsd:schema xmlns:xsd="http://www.w3.org/2001/XMLSchema" xmlns:xs="http://www.w3.org/2001/XMLSchema" xmlns:dms="http://schemas.microsoft.com/office/2006/documentManagement/types" xmlns:pc="http://schemas.microsoft.com/office/infopath/2007/PartnerControls" targetNamespace="98f0678e-2b8a-4b59-aaee-95acbf30ff79" elementFormDefault="qualified">
     <xsd:import namespace="http://schemas.microsoft.com/office/2006/documentManagement/types"/>
     <xsd:import namespace="http://schemas.microsoft.com/office/infopath/2007/PartnerControls"/>
     <xsd:element name="MediaServiceMetadata" ma:index="8" nillable="true" ma:displayName="MediaServiceMetadata" ma:hidden="true" ma:internalName="MediaServiceMetadata" ma:readOnly="true">
@@ -4081,18 +4087,49 @@
         <xsd:restriction base="dms:Note"/>
       </xsd:simpleType>
     </xsd:element>
-    <xsd:element name="MediaServiceDateTaken" ma:index="10" nillable="true" ma:displayName="MediaServiceDateTaken" ma:hidden="true" ma:indexed="true" ma:internalName="MediaServiceDateTaken" ma:readOnly="true">
+    <xsd:element name="MediaServiceAutoKeyPoints" ma:index="10" nillable="true" ma:displayName="MediaServiceAutoKeyPoints" ma:hidden="true" ma:internalName="MediaServiceAutoKeyPoints" ma:readOnly="true">
+      <xsd:simpleType>
+        <xsd:restriction base="dms:Note"/>
+      </xsd:simpleType>
+    </xsd:element>
+    <xsd:element name="MediaServiceKeyPoints" ma:index="11" nillable="true" ma:displayName="KeyPoints" ma:internalName="MediaServiceKeyPoints" ma:readOnly="true">
+      <xsd:simpleType>
+        <xsd:restriction base="dms:Note">
+          <xsd:maxLength value="255"/>
+        </xsd:restriction>
+      </xsd:simpleType>
+    </xsd:element>
+    <xsd:element name="lcf76f155ced4ddcb4097134ff3c332f" ma:index="15" nillable="true" ma:taxonomy="true" ma:internalName="lcf76f155ced4ddcb4097134ff3c332f" ma:taxonomyFieldName="MediaServiceImageTags" ma:displayName="Image Tags" ma:readOnly="false" ma:fieldId="{5cf76f15-5ced-4ddc-b409-7134ff3c332f}" ma:taxonomyMulti="true" ma:sspId="f242fb91-79a5-4b93-8a08-4d9fe80d6a61" ma:termSetId="09814cd3-568e-fe90-9814-8d621ff8fb84" ma:anchorId="fba54fb3-c3e1-fe81-a776-ca4b69148c4d" ma:open="true" ma:isKeyword="false">
+      <xsd:complexType>
+        <xsd:sequence>
+          <xsd:element ref="pc:Terms" minOccurs="0" maxOccurs="1"/>
+        </xsd:sequence>
+      </xsd:complexType>
+    </xsd:element>
+    <xsd:element name="MediaServiceOCR" ma:index="17" nillable="true" ma:displayName="Extracted Text" ma:internalName="MediaServiceOCR" ma:readOnly="true">
+      <xsd:simpleType>
+        <xsd:restriction base="dms:Note">
+          <xsd:maxLength value="255"/>
+        </xsd:restriction>
+      </xsd:simpleType>
+    </xsd:element>
+    <xsd:element name="MediaServiceGenerationTime" ma:index="18" nillable="true" ma:displayName="MediaServiceGenerationTime" ma:hidden="true" ma:internalName="MediaServiceGenerationTime" ma:readOnly="true">
       <xsd:simpleType>
         <xsd:restriction base="dms:Text"/>
       </xsd:simpleType>
     </xsd:element>
-    <xsd:element name="MediaLengthInSeconds" ma:index="11" nillable="true" ma:displayName="MediaLengthInSeconds" ma:hidden="true" ma:internalName="MediaLengthInSeconds" ma:readOnly="true">
+    <xsd:element name="MediaServiceEventHashCode" ma:index="19" nillable="true" ma:displayName="MediaServiceEventHashCode" ma:hidden="true" ma:internalName="MediaServiceEventHashCode" ma:readOnly="true">
       <xsd:simpleType>
-        <xsd:restriction base="dms:Unknown"/>
+        <xsd:restriction base="dms:Text"/>
+      </xsd:simpleType>
+    </xsd:element>
+    <xsd:element name="MediaServiceDateTaken" ma:index="20" nillable="true" ma:displayName="MediaServiceDateTaken" ma:hidden="true" ma:internalName="MediaServiceDateTaken" ma:readOnly="true">
+      <xsd:simpleType>
+        <xsd:restriction base="dms:Text"/>
       </xsd:simpleType>
     </xsd:element>
   </xsd:schema>
-  <xsd:schema xmlns:xsd="http://www.w3.org/2001/XMLSchema" xmlns:xs="http://www.w3.org/2001/XMLSchema" xmlns:dms="http://schemas.microsoft.com/office/2006/documentManagement/types" xmlns:pc="http://schemas.microsoft.com/office/infopath/2007/PartnerControls" targetNamespace="c6b11a66-ed80-4a70-a8b5-1ed9a8833426" elementFormDefault="qualified">
+  <xsd:schema xmlns:xsd="http://www.w3.org/2001/XMLSchema" xmlns:xs="http://www.w3.org/2001/XMLSchema" xmlns:dms="http://schemas.microsoft.com/office/2006/documentManagement/types" xmlns:pc="http://schemas.microsoft.com/office/infopath/2007/PartnerControls" targetNamespace="6bf2fe62-5324-41f9-928d-00b78b26d69e" elementFormDefault="qualified">
     <xsd:import namespace="http://schemas.microsoft.com/office/2006/documentManagement/types"/>
     <xsd:import namespace="http://schemas.microsoft.com/office/infopath/2007/PartnerControls"/>
     <xsd:element name="SharedWithUsers" ma:index="12" nillable="true" ma:displayName="Shared With" ma:internalName="SharedWithUsers" ma:readOnly="true">
@@ -4120,6 +4157,17 @@
           <xsd:maxLength value="255"/>
         </xsd:restriction>
       </xsd:simpleType>
+    </xsd:element>
+    <xsd:element name="TaxCatchAll" ma:index="16" nillable="true" ma:displayName="Taxonomy Catch All Column" ma:hidden="true" ma:list="{6f982fd8-8b83-4f98-83f0-c2b9f3188325}" ma:internalName="TaxCatchAll" ma:showField="CatchAllData" ma:web="6bf2fe62-5324-41f9-928d-00b78b26d69e">
+      <xsd:complexType>
+        <xsd:complexContent>
+          <xsd:extension base="dms:MultiChoiceLookup">
+            <xsd:sequence>
+              <xsd:element name="Value" type="dms:Lookup" maxOccurs="unbounded" minOccurs="0" nillable="true"/>
+            </xsd:sequence>
+          </xsd:extension>
+        </xsd:complexContent>
+      </xsd:complexType>
     </xsd:element>
   </xsd:schema>
   <xsd:schema xmlns="http://schemas.openxmlformats.org/package/2006/metadata/core-properties" xmlns:xsd="http://www.w3.org/2001/XMLSchema" xmlns:xsi="http://www.w3.org/2001/XMLSchema-instance" xmlns:dc="http://purl.org/dc/elements/1.1/" xmlns:dcterms="http://purl.org/dc/terms/" xmlns:odoc="http://schemas.microsoft.com/internal/obd" targetNamespace="http://schemas.openxmlformats.org/package/2006/metadata/core-properties" elementFormDefault="qualified" attributeFormDefault="unqualified" blockDefault="#all">
@@ -4232,7 +4280,12 @@
 
 <file path=customXml/item4.xml><?xml version="1.0" encoding="utf-8"?>
 <p:properties xmlns:p="http://schemas.microsoft.com/office/2006/metadata/properties" xmlns:xsi="http://www.w3.org/2001/XMLSchema-instance" xmlns:pc="http://schemas.microsoft.com/office/infopath/2007/PartnerControls">
-  <documentManagement/>
+  <documentManagement>
+    <TaxCatchAll xmlns="6bf2fe62-5324-41f9-928d-00b78b26d69e" xsi:nil="true"/>
+    <lcf76f155ced4ddcb4097134ff3c332f xmlns="98f0678e-2b8a-4b59-aaee-95acbf30ff79">
+      <Terms xmlns="http://schemas.microsoft.com/office/infopath/2007/PartnerControls"/>
+    </lcf76f155ced4ddcb4097134ff3c332f>
+  </documentManagement>
 </p:properties>
 </file>
 
@@ -4245,7 +4298,7 @@
 </file>
 
 <file path=customXml/itemProps2.xml><?xml version="1.0" encoding="utf-8"?>
-<ds:datastoreItem xmlns:ds="http://schemas.openxmlformats.org/officeDocument/2006/customXml" ds:itemID="{696F081D-EF15-4810-9A28-7C552B2ADA32}"/>
+<ds:datastoreItem xmlns:ds="http://schemas.openxmlformats.org/officeDocument/2006/customXml" ds:itemID="{51EDB514-E023-41ED-84A1-25CC48653AB5}"/>
 </file>
 
 <file path=customXml/itemProps3.xml><?xml version="1.0" encoding="utf-8"?>

</xml_diff>